<commit_message>
Update video links to video-educatin repo
</commit_message>
<xml_diff>
--- a/Rekap_Biaya_Bulanan_Edukasi_Catin.docx
+++ b/Rekap_Biaya_Bulanan_Edukasi_Catin.docx
@@ -15,13 +15,6 @@
       <w:pPr>
         <w:jc w:val="center"/>
       </w:pPr>
-      <w:r>
-        <w:rPr>
-          <w:b/>
-          <w:sz w:val="28"/>
-        </w:rPr>
-        <w:t xml:space="preserve">Web </w:t>
-      </w:r>
       <w:proofErr w:type="spellStart"/>
       <w:r>
         <w:rPr>
@@ -95,7 +88,13 @@
         <w:rPr>
           <w:sz w:val="20"/>
         </w:rPr>
-        <w:t>Periode: Per bulan | URL: https://iamwfs30.github.io/educatin-puskes-cakung/</w:t>
+        <w:t xml:space="preserve">Periode: Per bulan | URL: </w:t>
+      </w:r>
+      <w:r>
+        <w:rPr>
+          <w:sz w:val="20"/>
+        </w:rPr>
+        <w:t>https://iamsleepyhead00.github.io/educatin-puskes-cakung/</w:t>
       </w:r>
     </w:p>
     <w:p/>
@@ -106,6 +105,8 @@
       <w:r>
         <w:t>A. Biaya Infrastruktur</w:t>
       </w:r>
+      <w:bookmarkStart w:id="0" w:name="_GoBack"/>
+      <w:bookmarkEnd w:id="0"/>
     </w:p>
     <w:tbl>
       <w:tblPr>
@@ -115,11 +116,11 @@
         <w:tblLook w:val="04A0" w:firstRow="1" w:lastRow="0" w:firstColumn="1" w:lastColumn="0" w:noHBand="0" w:noVBand="1"/>
       </w:tblPr>
       <w:tblGrid>
-        <w:gridCol w:w="1728"/>
-        <w:gridCol w:w="1728"/>
-        <w:gridCol w:w="1728"/>
-        <w:gridCol w:w="1934"/>
-        <w:gridCol w:w="1728"/>
+        <w:gridCol w:w="1402"/>
+        <w:gridCol w:w="1594"/>
+        <w:gridCol w:w="1597"/>
+        <w:gridCol w:w="2640"/>
+        <w:gridCol w:w="1623"/>
       </w:tblGrid>
       <w:tr>
         <w:trPr>
@@ -341,7 +342,7 @@
           </w:tcPr>
           <w:p>
             <w:r>
-              <w:t>iamwfs30.github.io</w:t>
+              <w:t>iamsleepyhead00.github.io</w:t>
             </w:r>
           </w:p>
         </w:tc>
@@ -888,11 +889,7 @@
           </w:tcPr>
           <w:p>
             <w:r>
-              <w:t xml:space="preserve">Export rekap Google Sheets, </w:t>
-            </w:r>
-            <w:r>
-              <w:lastRenderedPageBreak/>
-              <w:t>backup source code</w:t>
+              <w:t>Export rekap Google Sheets, backup source code</w:t>
             </w:r>
           </w:p>
         </w:tc>
@@ -902,7 +899,6 @@
           </w:tcPr>
           <w:p>
             <w:r>
-              <w:lastRenderedPageBreak/>
               <w:t>Bulanan</w:t>
             </w:r>
           </w:p>
@@ -959,7 +955,11 @@
           </w:tcPr>
           <w:p>
             <w:r>
-              <w:t>Bantuan teknis via WhatsApp (jam kerja)</w:t>
+              <w:t xml:space="preserve">Bantuan teknis via WhatsApp </w:t>
+            </w:r>
+            <w:r>
+              <w:lastRenderedPageBreak/>
+              <w:t>(jam kerja)</w:t>
             </w:r>
           </w:p>
         </w:tc>
@@ -969,6 +969,7 @@
           </w:tcPr>
           <w:p>
             <w:r>
+              <w:lastRenderedPageBreak/>
               <w:t>Unlimited chat</w:t>
             </w:r>
           </w:p>
@@ -1232,8 +1233,13 @@
         <w:pStyle w:val="Heading1"/>
       </w:pPr>
       <w:r>
-        <w:t>D. Ketentuan</w:t>
+        <w:t xml:space="preserve">D. </w:t>
       </w:r>
+      <w:proofErr w:type="spellStart"/>
+      <w:r>
+        <w:t>Ketentuan</w:t>
+      </w:r>
+      <w:proofErr w:type="spellEnd"/>
     </w:p>
     <w:tbl>
       <w:tblPr>
@@ -1396,8 +1402,6 @@
             <w:r>
               <w:t>0.000/incident (&gt;4 incident/bulan)</w:t>
             </w:r>
-            <w:bookmarkStart w:id="0" w:name="_GoBack"/>
-            <w:bookmarkEnd w:id="0"/>
           </w:p>
         </w:tc>
       </w:tr>
@@ -1473,6 +1477,59 @@
       </w:tr>
     </w:tbl>
     <w:p/>
+    <w:p>
+      <w:pPr>
+        <w:pStyle w:val="Heading1"/>
+      </w:pPr>
+      <w:r>
+        <w:t>E</w:t>
+      </w:r>
+      <w:r>
+        <w:t xml:space="preserve">. </w:t>
+      </w:r>
+      <w:r>
+        <w:t>Project</w:t>
+      </w:r>
+    </w:p>
+    <w:p>
+      <w:pPr>
+        <w:jc w:val="center"/>
+      </w:pPr>
+      <w:r>
+        <w:pict>
+          <v:shapetype id="_x0000_t75" coordsize="21600,21600" o:spt="75" o:preferrelative="t" path="m@4@5l@4@11@9@11@9@5xe" filled="f" stroked="f">
+            <v:stroke joinstyle="miter"/>
+            <v:formulas>
+              <v:f eqn="if lineDrawn pixelLineWidth 0"/>
+              <v:f eqn="sum @0 1 0"/>
+              <v:f eqn="sum 0 0 @1"/>
+              <v:f eqn="prod @2 1 2"/>
+              <v:f eqn="prod @3 21600 pixelWidth"/>
+              <v:f eqn="prod @3 21600 pixelHeight"/>
+              <v:f eqn="sum @0 0 1"/>
+              <v:f eqn="prod @6 1 2"/>
+              <v:f eqn="prod @7 21600 pixelWidth"/>
+              <v:f eqn="sum @8 21600 0"/>
+              <v:f eqn="prod @7 21600 pixelHeight"/>
+              <v:f eqn="sum @10 21600 0"/>
+            </v:formulas>
+            <v:path o:extrusionok="f" gradientshapeok="t" o:connecttype="rect"/>
+            <o:lock v:ext="edit" aspectratio="t"/>
+          </v:shapetype>
+          <v:shape id="_x0000_i1025" type="#_x0000_t75" style="width:203.4pt;height:203.4pt">
+            <v:imagedata r:id="rId6" o:title="qrcode-educatin-sleepy"/>
+          </v:shape>
+        </w:pict>
+      </w:r>
+    </w:p>
+    <w:p>
+      <w:pPr>
+        <w:jc w:val="center"/>
+      </w:pPr>
+      <w:r>
+        <w:t>Gambar 1. QR Code</w:t>
+      </w:r>
+    </w:p>
     <w:sectPr>
       <w:pgSz w:w="12240" w:h="15840"/>
       <w:pgMar w:top="1440" w:right="1800" w:bottom="1440" w:left="1800" w:header="720" w:footer="720" w:gutter="0"/>
@@ -13392,7 +13449,7 @@
 </file>
 
 <file path=customXml/itemProps1.xml><?xml version="1.0" encoding="utf-8"?>
-<ds:datastoreItem xmlns:ds="http://schemas.openxmlformats.org/officeDocument/2006/customXml" ds:itemID="{C21BE99A-0715-4B13-8179-A95A6A28B94C}">
+<ds:datastoreItem xmlns:ds="http://schemas.openxmlformats.org/officeDocument/2006/customXml" ds:itemID="{1AB9E293-4DA0-4761-8895-C19F8FC632C5}">
   <ds:schemaRefs>
     <ds:schemaRef ds:uri="http://schemas.openxmlformats.org/officeDocument/2006/bibliography"/>
   </ds:schemaRefs>

</xml_diff>